<commit_message>
Minor change to template and piece 4 and 6.
</commit_message>
<xml_diff>
--- a/Working Folder/Front Matter Template/SCO Front Matter Template_v2.docx
+++ b/Working Folder/Front Matter Template/SCO Front Matter Template_v2.docx
@@ -67,14 +67,14 @@
       <w:pPr>
         <w:jc w:val="right"/>
         <w:rPr>
-          <w:rFonts w:ascii="Noto Serif SC" w:eastAsia="Noto Serif SC" w:hAnsi="Noto Serif SC"/>
+          <w:rFonts w:ascii="Noto Serif" w:eastAsia="Noto Serif SC" w:hAnsi="Noto Serif" w:cs="Noto Serif"/>
           <w:sz w:val="36"/>
           <w:szCs w:val="72"/>
         </w:rPr>
       </w:pPr>
       <w:r>
         <w:rPr>
-          <w:rFonts w:ascii="Noto Serif SC" w:eastAsia="Noto Serif SC" w:hAnsi="Noto Serif SC" w:hint="eastAsia"/>
+          <w:rFonts w:ascii="Noto Serif" w:eastAsia="Noto Serif SC" w:hAnsi="Noto Serif" w:cs="Noto Serif"/>
           <w:sz w:val="36"/>
           <w:szCs w:val="72"/>
         </w:rPr>
@@ -2965,25 +2965,7 @@
           <w:sz w:val="24"/>
           <w:szCs w:val="24"/>
         </w:rPr>
-        <w:t xml:space="preserve"> </w:t>
-      </w:r>
-      <w:proofErr w:type="spellStart"/>
-      <w:r>
-        <w:rPr>
-          <w:rFonts w:ascii="Noto Serif SC" w:eastAsia="Noto Serif SC" w:hAnsi="Noto Serif SC"/>
-          <w:sz w:val="24"/>
-          <w:szCs w:val="24"/>
-        </w:rPr>
-        <w:t>laborum</w:t>
-      </w:r>
-      <w:proofErr w:type="spellEnd"/>
-      <w:r>
-        <w:rPr>
-          <w:rFonts w:ascii="Noto Serif SC" w:eastAsia="Noto Serif SC" w:hAnsi="Noto Serif SC"/>
-          <w:sz w:val="24"/>
-          <w:szCs w:val="24"/>
-        </w:rPr>
-        <w:t>.</w:t>
+        <w:t xml:space="preserve"> laborum.</w:t>
       </w:r>
     </w:p>
     <w:p>
@@ -4786,25 +4768,7 @@
           <w:sz w:val="24"/>
           <w:szCs w:val="24"/>
         </w:rPr>
-        <w:t xml:space="preserve"> </w:t>
-      </w:r>
-      <w:proofErr w:type="spellStart"/>
-      <w:r>
-        <w:rPr>
-          <w:rFonts w:ascii="Noto Serif SC" w:eastAsia="Noto Serif SC" w:hAnsi="Noto Serif SC"/>
-          <w:sz w:val="24"/>
-          <w:szCs w:val="24"/>
-        </w:rPr>
-        <w:t>laborum</w:t>
-      </w:r>
-      <w:proofErr w:type="spellEnd"/>
-      <w:r>
-        <w:rPr>
-          <w:rFonts w:ascii="Noto Serif SC" w:eastAsia="Noto Serif SC" w:hAnsi="Noto Serif SC"/>
-          <w:sz w:val="24"/>
-          <w:szCs w:val="24"/>
-        </w:rPr>
-        <w:t>.</w:t>
+        <w:t xml:space="preserve"> laborum.</w:t>
       </w:r>
     </w:p>
     <w:p>
@@ -6022,25 +5986,7 @@
           <w:sz w:val="24"/>
           <w:szCs w:val="24"/>
         </w:rPr>
-        <w:t xml:space="preserve"> </w:t>
-      </w:r>
-      <w:proofErr w:type="spellStart"/>
-      <w:r>
-        <w:rPr>
-          <w:rFonts w:ascii="Noto Serif SC" w:eastAsia="Noto Serif SC" w:hAnsi="Noto Serif SC"/>
-          <w:sz w:val="24"/>
-          <w:szCs w:val="24"/>
-        </w:rPr>
-        <w:t>laborum</w:t>
-      </w:r>
-      <w:proofErr w:type="spellEnd"/>
-      <w:r>
-        <w:rPr>
-          <w:rFonts w:ascii="Noto Serif SC" w:eastAsia="Noto Serif SC" w:hAnsi="Noto Serif SC"/>
-          <w:sz w:val="24"/>
-          <w:szCs w:val="24"/>
-        </w:rPr>
-        <w:t>.</w:t>
+        <w:t xml:space="preserve"> laborum.</w:t>
       </w:r>
     </w:p>
     <w:p>
@@ -7593,6 +7539,7 @@
   <w:style w:type="character" w:default="1" w:styleId="DefaultParagraphFont">
     <w:name w:val="Default Paragraph Font"/>
     <w:uiPriority w:val="1"/>
+    <w:semiHidden/>
     <w:unhideWhenUsed/>
   </w:style>
   <w:style w:type="table" w:default="1" w:styleId="TableNormal">

</xml_diff>